<commit_message>
phase 13 - macos
</commit_message>
<xml_diff>
--- a/docs/GraphX_Architecture.docx
+++ b/docs/GraphX_Architecture.docx
@@ -561,7 +561,7 @@
         <w:rPr>
           <w:rFonts w:ascii="Aptos" w:hAnsi="Aptos"/>
         </w:rPr>
-        <w:t>The architecture is suitable for reproducible laboratories and controlled demonstrations. Its present limits are equally important: configuration version 1 allows only DAGs; infrastructure provisioning is create/destroy rather than reconciliation; UDP is bounded but unreliable; multicast remains one logical producer-to-consumer edge; capture does not rotate automatically; OVS and application captures are not automatically cross-correlated; QEMU uses user-mode networking rather than TAP; and the telemetry/control system is a single-collector control domain rather than a distributed control plane.</w:t>
+        <w:t>The architecture is suitable for reproducible laboratories and controlled demonstrations. Its present limits are equally important: configuration version 1 allows only DAGs for GraphX-managed execution (external raw device relationships may loop); infrastructure provisioning is create/destroy rather than reconciliation; UDP is bounded but unreliable; multicast remains one logical producer-to-consumer edge; capture does not rotate automatically; OVS and application captures are not automatically cross-correlated; QEMU uses user-mode networking rather than TAP; and the telemetry/control system is a single-collector control domain rather than a distributed control plane.</w:t>
       </w:r>
     </w:p>
     <w:p>
@@ -2873,7 +2873,7 @@
         <w:rPr>
           <w:rFonts w:ascii="Aptos" w:hAnsi="Aptos"/>
         </w:rPr>
-        <w:t xml:space="preserve"> ports, a transport name, and a data-plane classification. Version 1 requires a directed acyclic graph because the current blocking startup/lifecycle model cannot safely schedule feedback cycles.</w:t>
+        <w:t xml:space="preserve"> ports, a transport name, and a data-plane classification. Version 1 requires the GraphX-managed data plane to be a directed acyclic graph because the current blocking startup/lifecycle model cannot safely schedule feedback cycles. External raw edges are descriptive rather than scheduled and may form a physical control/data loop; ADR 0014 records that narrow exception.</w:t>
       </w:r>
     </w:p>
     <w:p>
@@ -4263,7 +4263,7 @@
                 <w:color w:val="111820"/>
                 <w:sz w:val="16"/>
               </w:rPr>
-              <w:t>Both QEMU profiles</w:t>
+              <w:t>QEMU and SDR profiles</w:t>
             </w:r>
           </w:p>
         </w:tc>
@@ -8493,6 +8493,175 @@
           </w:p>
         </w:tc>
       </w:tr>
+      <w:tr>
+        <w:trPr>
+          <w:cantSplit/>
+        </w:trPr>
+        <w:tc>
+          <w:tcPr>
+            <w:tcW w:type="dxa" w:w="2592"/>
+            <w:vAlign w:val="center"/>
+            <w:tcMar>
+              <w:top w:w="90" w:type="dxa"/>
+              <w:start w:w="110" w:type="dxa"/>
+              <w:bottom w:w="90" w:type="dxa"/>
+              <w:end w:w="110" w:type="dxa"/>
+            </w:tcMar>
+          </w:tcPr>
+          <w:p>
+            <w:pPr>
+              <w:spacing w:after="0"/>
+            </w:pPr>
+            <w:r>
+              <w:rPr>
+                <w:rFonts w:ascii="Aptos" w:hAnsi="Aptos"/>
+                <w:b w:val="0"/>
+                <w:color w:val="111820"/>
+                <w:sz w:val="17"/>
+              </w:rPr>
+              <w:t>Simulated SDR</w:t>
+            </w:r>
+          </w:p>
+        </w:tc>
+        <w:tc>
+          <w:tcPr>
+            <w:tcW w:type="dxa" w:w="3816"/>
+            <w:vAlign w:val="center"/>
+            <w:tcMar>
+              <w:top w:w="90" w:type="dxa"/>
+              <w:start w:w="110" w:type="dxa"/>
+              <w:bottom w:w="90" w:type="dxa"/>
+              <w:end w:w="110" w:type="dxa"/>
+            </w:tcMar>
+          </w:tcPr>
+          <w:p>
+            <w:pPr>
+              <w:spacing w:after="0"/>
+            </w:pPr>
+            <w:r>
+              <w:rPr>
+                <w:rFonts w:ascii="Aptos" w:hAnsi="Aptos"/>
+                <w:b w:val="0"/>
+                <w:color w:val="111820"/>
+                <w:sz w:val="17"/>
+              </w:rPr>
+              <w:t>Raw UDP IQ, mutual-TLS control, raw results, live GUI, packet history</w:t>
+            </w:r>
+          </w:p>
+        </w:tc>
+        <w:tc>
+          <w:tcPr>
+            <w:tcW w:type="dxa" w:w="3168"/>
+            <w:vAlign w:val="center"/>
+            <w:tcMar>
+              <w:top w:w="90" w:type="dxa"/>
+              <w:start w:w="110" w:type="dxa"/>
+              <w:bottom w:w="90" w:type="dxa"/>
+              <w:end w:w="110" w:type="dxa"/>
+            </w:tcMar>
+          </w:tcPr>
+          <w:p>
+            <w:pPr>
+              <w:spacing w:after="0"/>
+            </w:pPr>
+            <w:r>
+              <w:rPr>
+                <w:rFonts w:ascii="Aptos" w:hAnsi="Aptos"/>
+                <w:b w:val="0"/>
+                <w:color w:val="111820"/>
+                <w:sz w:val="17"/>
+              </w:rPr>
+              <w:t>Docker Desktop or Linux; unprivileged except capture sidecar capabilities</w:t>
+            </w:r>
+          </w:p>
+        </w:tc>
+      </w:tr>
+      <w:tr>
+        <w:trPr>
+          <w:cantSplit/>
+        </w:trPr>
+        <w:tc>
+          <w:tcPr>
+            <w:tcW w:type="dxa" w:w="2592"/>
+            <w:vAlign w:val="center"/>
+            <w:tcMar>
+              <w:top w:w="90" w:type="dxa"/>
+              <w:start w:w="110" w:type="dxa"/>
+              <w:bottom w:w="90" w:type="dxa"/>
+              <w:end w:w="110" w:type="dxa"/>
+            </w:tcMar>
+            <w:shd w:fill="F3F5F7"/>
+          </w:tcPr>
+          <w:p>
+            <w:pPr>
+              <w:spacing w:after="0"/>
+            </w:pPr>
+            <w:r>
+              <w:rPr>
+                <w:rFonts w:ascii="Aptos" w:hAnsi="Aptos"/>
+                <w:b w:val="0"/>
+                <w:color w:val="111820"/>
+                <w:sz w:val="17"/>
+              </w:rPr>
+              <w:t>External SDR</w:t>
+            </w:r>
+          </w:p>
+        </w:tc>
+        <w:tc>
+          <w:tcPr>
+            <w:tcW w:type="dxa" w:w="3816"/>
+            <w:vAlign w:val="center"/>
+            <w:tcMar>
+              <w:top w:w="90" w:type="dxa"/>
+              <w:start w:w="110" w:type="dxa"/>
+              <w:bottom w:w="90" w:type="dxa"/>
+              <w:end w:w="110" w:type="dxa"/>
+            </w:tcMar>
+            <w:shd w:fill="F3F5F7"/>
+          </w:tcPr>
+          <w:p>
+            <w:pPr>
+              <w:spacing w:after="0"/>
+            </w:pPr>
+            <w:r>
+              <w:rPr>
+                <w:rFonts w:ascii="Aptos" w:hAnsi="Aptos"/>
+                <w:b w:val="0"/>
+                <w:color w:val="111820"/>
+                <w:sz w:val="17"/>
+              </w:rPr>
+              <w:t>External hardware boundary, macvlan, OVS/SPAN, ordinary Ethernet capture</w:t>
+            </w:r>
+          </w:p>
+        </w:tc>
+        <w:tc>
+          <w:tcPr>
+            <w:tcW w:type="dxa" w:w="3168"/>
+            <w:vAlign w:val="center"/>
+            <w:tcMar>
+              <w:top w:w="90" w:type="dxa"/>
+              <w:start w:w="110" w:type="dxa"/>
+              <w:bottom w:w="90" w:type="dxa"/>
+              <w:end w:w="110" w:type="dxa"/>
+            </w:tcMar>
+            <w:shd w:fill="F3F5F7"/>
+          </w:tcPr>
+          <w:p>
+            <w:pPr>
+              <w:spacing w:after="0"/>
+            </w:pPr>
+            <w:r>
+              <w:rPr>
+                <w:rFonts w:ascii="Aptos" w:hAnsi="Aptos"/>
+                <w:b w:val="0"/>
+                <w:color w:val="111820"/>
+                <w:sz w:val="17"/>
+              </w:rPr>
+              <w:t>Native Linux; privileged infrastructure lifecycle</w:t>
+            </w:r>
+          </w:p>
+        </w:tc>
+      </w:tr>
     </w:tbl>
     <w:p>
       <w:pPr>
@@ -8523,7 +8692,7 @@
         <w:rPr>
           <w:rFonts w:ascii="Aptos" w:hAnsi="Aptos"/>
         </w:rPr>
-        <w:t>Configuration v1 rejects cycles and native one-to-many graph edges.</w:t>
+        <w:t>Configuration v1 rejects cycles in the GraphX-managed data plane and native one-to-many graph edges. Descriptive external raw edges may form device data/control loops.</w:t>
       </w:r>
     </w:p>
     <w:p>
@@ -8776,22 +8945,29 @@
         <w:pStyle w:val="Heading2"/>
       </w:pPr>
       <w:r>
-        <w:t>12.1 Single SDR → switch → processor → sink</w:t>
+        <w:t>12.1 Single SDR → switch → processor → sink (implemented in Phase 13)</w:t>
       </w:r>
     </w:p>
     <w:p>
       <w:r>
         <w:rPr>
           <w:rFonts w:ascii="Aptos" w:hAnsi="Aptos"/>
-          <w:b/>
-        </w:rPr>
-        <w:t>Priority: high.</w:t>
+        </w:rPr>
+        <w:t xml:space="preserve">The </w:t>
+      </w:r>
+      <w:r>
+        <w:rPr>
+          <w:rFonts w:ascii="Aptos Mono" w:hAnsi="Aptos Mono"/>
+          <w:color w:val="153B57"/>
+          <w:sz w:val="17"/>
+        </w:rPr>
+        <w:t>examples/sdr-node</w:t>
       </w:r>
       <w:r>
         <w:rPr>
           <w:rFonts w:ascii="Aptos" w:hAnsi="Aptos"/>
         </w:rPr>
-        <w:t xml:space="preserve"> Model one external Ethernet-connected SDR sending UDP IQ/sample blocks to one containerized processor, with a TLS/TCP control edge back to the SDR and a result edge to a sink. Place an OVS switch and SPAN port on the data path. This is the smallest example that combines the user’s SDR goal with external raw edges, mixed UDP/TCP semantics, Ethernet PCAPNG, packet history, and the GUI without introducing a large topology.</w:t>
+        <w:t xml:space="preserve"> suite models one external Ethernet-connected SDR sending UDP IQ/sample blocks to one containerized processor, with a mutual-TLS TCP control edge back to the SDR and a result edge to a sink. Its native-Linux profile places OVS and SPAN on the data path; its portable profile clearly models Docker bridge switching as a simulation. Both reuse one deterministic endpoint and packet observer and feed Ethernet PCAPNG, bounded packet history, live telemetry, capture download, and the existing GUI.</w:t>
       </w:r>
     </w:p>
     <w:p>
@@ -8799,7 +8975,7 @@
         <w:rPr>
           <w:rFonts w:ascii="Aptos" w:hAnsi="Aptos"/>
         </w:rPr>
-        <w:t>Recommended staging:</w:t>
+        <w:t>Delivered profiles and deferred extension:</w:t>
       </w:r>
     </w:p>
     <w:p>
@@ -8810,7 +8986,7 @@
         <w:rPr>
           <w:rFonts w:ascii="Aptos" w:hAnsi="Aptos"/>
         </w:rPr>
-        <w:t>1. simulated SDR container using raw UDP data and TCP control;</w:t>
+        <w:t>1. simulated SDR container using raw UDP data and authenticated TCP control;</w:t>
       </w:r>
     </w:p>
     <w:p>
@@ -8821,7 +8997,7 @@
         <w:rPr>
           <w:rFonts w:ascii="Aptos" w:hAnsi="Aptos"/>
         </w:rPr>
-        <w:t>2. external physical-SDR profile using the same logical model;</w:t>
+        <w:t>2. external-device contract plus native Linux namespace/OVS/SPAN verifier;</w:t>
       </w:r>
     </w:p>
     <w:p>
@@ -8832,7 +9008,7 @@
         <w:rPr>
           <w:rFonts w:ascii="Aptos" w:hAnsi="Aptos"/>
         </w:rPr>
-        <w:t>3. optional QEMU-based SDR emulator profile.</w:t>
+        <w:t>3. optional QEMU-based SDR emulator profile remains a later enhancement.</w:t>
       </w:r>
     </w:p>
     <w:p>
@@ -9068,7 +9244,7 @@
         <w:rPr>
           <w:rFonts w:ascii="Aptos" w:hAnsi="Aptos"/>
         </w:rPr>
-        <w:t>1. Implement the single-SDR example in simulated and external profiles.</w:t>
+        <w:t>1. Independently verify the single-SDR example on macOS and native Linux.</w:t>
       </w:r>
     </w:p>
     <w:p>
@@ -10706,6 +10882,82 @@
                 <w:color w:val="111820"/>
                 <w:sz w:val="17"/>
               </w:rPr>
+              <w:t>SDR profiles</w:t>
+            </w:r>
+          </w:p>
+        </w:tc>
+        <w:tc>
+          <w:tcPr>
+            <w:tcW w:type="dxa" w:w="6696"/>
+            <w:vAlign w:val="center"/>
+            <w:tcMar>
+              <w:top w:w="90" w:type="dxa"/>
+              <w:start w:w="110" w:type="dxa"/>
+              <w:bottom w:w="90" w:type="dxa"/>
+              <w:end w:w="110" w:type="dxa"/>
+            </w:tcMar>
+          </w:tcPr>
+          <w:p>
+            <w:pPr>
+              <w:spacing w:after="0"/>
+            </w:pPr>
+            <w:r>
+              <w:rPr>
+                <w:rFonts w:ascii="Aptos" w:hAnsi="Aptos"/>
+                <w:b w:val="0"/>
+                <w:color w:val="111820"/>
+                <w:sz w:val="17"/>
+              </w:rPr>
+              <w:t>examples/sdr-node</w:t>
+            </w:r>
+            <w:r>
+              <w:rPr>
+                <w:rFonts w:ascii="Aptos" w:hAnsi="Aptos"/>
+                <w:b w:val="0"/>
+                <w:color w:val="111820"/>
+                <w:sz w:val="17"/>
+              </w:rPr>
+              <w:t xml:space="preserve">, </w:t>
+            </w:r>
+            <w:r>
+              <w:rPr>
+                <w:rFonts w:ascii="Aptos" w:hAnsi="Aptos"/>
+                <w:b w:val="0"/>
+                <w:color w:val="111820"/>
+                <w:sz w:val="17"/>
+              </w:rPr>
+              <w:t>docs/adr/0014-external-device-control-cycles.md</w:t>
+            </w:r>
+          </w:p>
+        </w:tc>
+      </w:tr>
+      <w:tr>
+        <w:trPr>
+          <w:cantSplit/>
+        </w:trPr>
+        <w:tc>
+          <w:tcPr>
+            <w:tcW w:type="dxa" w:w="2880"/>
+            <w:vAlign w:val="center"/>
+            <w:tcMar>
+              <w:top w:w="90" w:type="dxa"/>
+              <w:start w:w="110" w:type="dxa"/>
+              <w:bottom w:w="90" w:type="dxa"/>
+              <w:end w:w="110" w:type="dxa"/>
+            </w:tcMar>
+            <w:shd w:fill="F3F5F7"/>
+          </w:tcPr>
+          <w:p>
+            <w:pPr>
+              <w:spacing w:after="0"/>
+            </w:pPr>
+            <w:r>
+              <w:rPr>
+                <w:rFonts w:ascii="Aptos" w:hAnsi="Aptos"/>
+                <w:b w:val="0"/>
+                <w:color w:val="111820"/>
+                <w:sz w:val="17"/>
+              </w:rPr>
               <w:t>Verification status</w:t>
             </w:r>
           </w:p>
@@ -10720,6 +10972,7 @@
               <w:bottom w:w="90" w:type="dxa"/>
               <w:end w:w="110" w:type="dxa"/>
             </w:tcMar>
+            <w:shd w:fill="F3F5F7"/>
           </w:tcPr>
           <w:p>
             <w:pPr>

</xml_diff>

<commit_message>
version update and license check
</commit_message>
<xml_diff>
--- a/docs/GraphX_Architecture.docx
+++ b/docs/GraphX_Architecture.docx
@@ -57,7 +57,7 @@
                 <w:color w:val="FFFFFF"/>
                 <w:sz w:val="24"/>
               </w:rPr>
-              <w:t>GraphX 1.0.0</w:t>
+              <w:t>GraphX 1.1.0</w:t>
               <w:br/>
               <w:t>Repository architecture baseline</w:t>
               <w:br/>
@@ -11085,7 +11085,7 @@
         <w:rPr>
           <w:rFonts w:ascii="Aptos" w:hAnsi="Aptos"/>
         </w:rPr>
-        <w:t>Root documentation identifies GraphX 1.0.0 and distinguishes accepted Phase 3–13 reports from the Phase 1 and Phase 2 documentary gaps; Phase 14 awaits native verification.</w:t>
+        <w:t>Root documentation identifies GraphX 1.1.0 and distinguishes accepted Phase 3–13 reports from the Phase 1 and Phase 2 documentary gaps; Phase 14 awaits native verification.</w:t>
       </w:r>
     </w:p>
     <w:p>
@@ -11368,7 +11368,7 @@
         <w:rPr>
           <w:rFonts w:ascii="Aptos" w:hAnsi="Aptos"/>
         </w:rPr>
-        <w:t>2. Root maturity wording matches 1.0.0 and qualifies the accepted Phase 3–13 verification record.</w:t>
+        <w:t>2. Root maturity wording matches 1.1.0 and qualifies the accepted Phase 3–13 verification record.</w:t>
       </w:r>
     </w:p>
     <w:p>

</xml_diff>